<commit_message>
Correct RU-03 citation and gap-claim overstatements per instructor feedback
- Fixed Zhou et al. citation: year was wrong (2025 vs actual 2026),
  title was fabricated, and 6 of 7 authors' middle initials were
  wrong. Original verification had confirmed the paper existed at the
  right DOI but relied on a search-result summary rather than the
  actual article page for author/title details.
- Softened 'competing systems don't attempt routing' language in
  Sections 2 and 3 to note it's based on published documentation only,
  not an audit of undocumented internals.
- AI_USE_LOG.md Entry 10 documents the correction and its root cause.
- ENGINEERING_LOG.md: added the correction, plus the supervisor-review
  lesson (disclosure isn't sufficient when a task explicitly asks for
  the actual conversation).

Co-Authored-By: Claude Sonnet 5 <noreply@anthropic.com>
</commit_message>
<xml_diff>
--- a/docs/CISC699_Literature_Requirements_Brief.docx
+++ b/docs/CISC699_Literature_Requirements_Brief.docx
@@ -2193,7 +2193,7 @@
           <w:sz w:val="22"/>
           <w:szCs w:val="22"/>
         </w:rPr>
-        <w:t xml:space="preserve">The literature here is consistent: bid/announce/award mechanisms (Smith, 1980) are a well-established, sound architecture for allocating tasks among distributed agents, and market-based variants of this pattern have been validated at real scale in at least one closely analogous domain — ambulance dispatch, evaluated against more than a million real incidents (Schneider et al., 2020). Dias et al. (2006) situates this within a broader family of auction- and market-based coordination methods. Two very recent sources extend this further: Zhou et al. (2025) validates combining auction-based allocation with AHP-derived fitness weighting, essentially the same pairing this project uses; and Hady et al. (2025) surveys multi-agent reinforcement learning for resource allocation, representing the learned-policy direction this field is moving toward. The consistent theme is that market-based allocation is mature and trusted; what varies is how the scoring inside it gets calibrated.</w:t>
+        <w:t xml:space="preserve">The literature here is consistent: bid/announce/award mechanisms (Smith, 1980) are a well-established, sound architecture for allocating tasks among distributed agents, and market-based variants of this pattern have been validated at real scale in at least one closely analogous domain — ambulance dispatch, evaluated against more than a million real incidents (Schneider et al., 2020). Dias et al. (2006) situates this within a broader family of auction- and market-based coordination methods. Two very recent sources extend this further: Zhou et al. (2026) validates combining auction-based allocation with AHP-derived task-fitness weighting, essentially the same pairing this project uses; and Hady et al. (2025) surveys multi-agent reinforcement learning for resource allocation, representing the learned-policy direction this field is moving toward. The consistent theme is that market-based allocation is mature and trusted; what varies is how the scoring inside it gets calibrated.</w:t>
       </w:r>
     </w:p>
     <w:p>
@@ -2255,7 +2255,7 @@
           <w:sz w:val="22"/>
           <w:szCs w:val="22"/>
         </w:rPr>
-        <w:t xml:space="preserve">Existing shelter-management platforms — Shelterluv, used by more than 2,500 shelters and rescues (Shelterluv, 2026), and RescueGroups.org, a nonprofit platform serving over 6,000 partner organizations that feeds adoptable-animal listings to sites like Petfinder (RescueGroups.org, 2026) — are workflow and record-management tools: intake records, medical history, adoption checkout, donation processing. Neither exposes or claims to solve an automated, evaluable case-routing or match-scoring decision. This is the clearest evidence for this project's niche: the competing-systems space manages shelter data well but does not attempt the routing-optimization problem RescueNet's arbitrator addresses.</w:t>
+        <w:t xml:space="preserve">Existing shelter-management platforms — Shelterluv, used by more than 2,500 shelters and rescues (Shelterluv, 2026), and RescueGroups.org, a nonprofit platform serving over 6,000 partner organizations that feeds adoptable-animal listings to sites like Petfinder (RescueGroups.org, 2026) — are workflow and record-management tools: intake records, medical history, adoption checkout, donation processing. Based on their public feature documentation, neither advertises or documents an automated, evaluable case-routing or match-scoring capability; this is evidence toward, not proof of, this project's niche — the platforms' internal logic was not audited, and either could implement undocumented internal matching. What their published documentation does support is that shelter software's marketed value proposition is data/workflow management, not decision optimization.</w:t>
       </w:r>
     </w:p>
     <w:p>
@@ -2348,7 +2348,7 @@
           <w:sz w:val="22"/>
           <w:szCs w:val="22"/>
         </w:rPr>
-        <w:t xml:space="preserve">Competing systems (Theme 3) show that shelter software broadly ignores the routing-decision problem. Academic multi-agent and market-based methods (Theme 1) show that the underlying architecture is sound and validated in an analogous domain. AHP (Theme 2) supplies a defensible way to calibrate that architecture's scoring without requiring data this project does not have. Evaluation-strategy literature (Theme 4) confirms that the resulting real-plus-synthetic evaluation plan is methodologically appropriate given that same data constraint, not a limitation unique to this project. Governance literature (Theme 5) frames the disclosure and risk-tracking practice already underway. This project's contribution is therefore narrow and specific: applying validated, literature-grounded methods (AHP, market-based allocation) to harden one real, deployed, and otherwise-unaddressed decision point — case routing — inside a system that already exists, rather than proposing a new architecture or a new class of shelter software.</w:t>
+        <w:t xml:space="preserve">Competing systems (Theme 3), based on their published documentation, do not market or describe a routing-decision capability, though their undocumented internals were not audited and this evidence is suggestive rather than conclusive. Academic multi-agent and market-based methods (Theme 1) show that the underlying architecture is sound and validated in an analogous domain. AHP (Theme 2) supplies a defensible way to calibrate that architecture's scoring without requiring data this project does not have. Evaluation-strategy literature (Theme 4) confirms that the resulting real-plus-synthetic evaluation plan is methodologically appropriate given that same data constraint, not a limitation unique to this project. Governance literature (Theme 5) frames the disclosure and risk-tracking practice already underway. This project's contribution is therefore narrow and specific: applying validated, literature-grounded methods (AHP, market-based allocation) to harden one real, deployed, and otherwise-unaddressed decision point — case routing — inside a system that already exists, rather than proposing a new architecture or a new class of shelter software.</w:t>
       </w:r>
     </w:p>
     <w:p>
@@ -2490,7 +2490,7 @@
           <w:sz w:val="22"/>
           <w:szCs w:val="22"/>
         </w:rPr>
-        <w:t xml:space="preserve">Zhou, Y., Lan, Y., Yang, Z., Wang, Y., Li, X., Li, Y., &amp; Lyu, C. (2025). An auction-based task allocation approach with AHP-derived fitness for multi-agent systems. Frontiers in Physics, 13, Article 1617607.</w:t>
+        <w:t xml:space="preserve">Zhou, Y., Lan, Q., Yang, X., Wang, L., Li, G., Li, S., &amp; Lyu, T. (2026). Multi-agent task allocation method based on the cost-effectiveness maximization multi-round auction algorithm. Frontiers in Physics, 13. https://doi.org/10.3389/fphy.2025.1617607</w:t>
       </w:r>
     </w:p>
     <w:p>

</xml_diff>

<commit_message>
Hard Stop 2 rubric audit: close gaps; correct data flow and RU-03 needs-table claim
Adds tradeoff analysis, reproducible setup, data-validation steps, failure-mode
table, interface table, weight-derivation figure, revised success criteria, and
separate risks/dependencies/gaps lists. Corrects Figure 2 to the real EventBridge
fan-out and corrects the repo copy of the RU-03 brief: rescuenet-needs is an unused
table, not a duplicate of the Case item's needsProfile.

Co-Authored-By: Claude Sonnet 5 <noreply@anthropic.com>
</commit_message>
<xml_diff>
--- a/docs/CISC699_Literature_Requirements_Brief.docx
+++ b/docs/CISC699_Literature_Requirements_Brief.docx
@@ -5084,7 +5084,7 @@
                 <w:sz w:val="20"/>
                 <w:szCs w:val="20"/>
               </w:rPr>
-              <w:t xml:space="preserve">eventHistory is an unbounded list attribute with no size cap; needsProfile is duplicated here and in the separate rescuenet-needs table with no single source of truth.</w:t>
+              <w:t xml:space="preserve">eventHistory is an unbounded list attribute with no size cap; the needsProfile attribute on this item is the only place a needs profile is stored (the separate rescuenet-needs table is never written or read; see below).</w:t>
             </w:r>
           </w:p>
         </w:tc>
@@ -5389,7 +5389,7 @@
                 <w:sz w:val="20"/>
                 <w:szCs w:val="20"/>
               </w:rPr>
-              <w:t xml:space="preserve">Generated by the needs-profile Lambda's Bedrock reasoning call for each case.</w:t>
+              <w:t xml:space="preserve">Provisioned in the CDK stack and granted to every Lambda role, but no Lambda code reads or writes it. Needs profiles are generated by the needs-profile Lambda and stored on the Case item instead.</w:t>
             </w:r>
           </w:p>
         </w:tc>
@@ -5418,7 +5418,7 @@
                 <w:sz w:val="20"/>
                 <w:szCs w:val="20"/>
               </w:rPr>
-              <w:t xml:space="preserve">caseId (PK); hardConstraints, softWeights (five factors), urgencyLevel, reasoning.</w:t>
+              <w:t xml:space="preserve">caseId (PK) as defined in the CDK stack; no items are written by the application.</w:t>
             </w:r>
           </w:p>
         </w:tc>
@@ -5447,7 +5447,7 @@
                 <w:sz w:val="20"/>
                 <w:szCs w:val="20"/>
               </w:rPr>
-              <w:t xml:space="preserve">Duplicated onto the Case item's own needsProfile attribute (see above); the softWeights values are exactly what SC2's AHP work will replace.</w:t>
+              <w:t xml:space="preserve">Unused table (dead infrastructure), not a duplicate. Corrected 2026-09-26: an earlier version of this brief wrongly described it as duplicating the Case item's needsProfile. The softWeights on the Case item are what the hardening work will replace.</w:t>
             </w:r>
           </w:p>
         </w:tc>

</xml_diff>